<commit_message>
AWP Week 7 - Reports
</commit_message>
<xml_diff>
--- a/web-lanjut/week-7/Week7-AuthenticationAuthorization.docx
+++ b/web-lanjut/week-7/Week7-AuthenticationAuthorization.docx
@@ -921,7 +921,7 @@
           <w:color w:val="000000" w:themeColor="text1"/>
         </w:rPr>
         <w:drawing>
-          <wp:inline distT="0" distB="0" distL="0" distR="0" wp14:anchorId="4DA7E4C6" wp14:editId="3D006A07">
+          <wp:inline distT="0" distB="0" distL="0" distR="0" wp14:anchorId="4DA7E4C6" wp14:editId="73F843A4">
             <wp:extent cx="2818349" cy="1386602"/>
             <wp:effectExtent l="0" t="0" r="1270" b="0"/>
             <wp:docPr id="1180260139" name="Picture 6" descr="A screen shot of a computer program&#10;&#10;Description automatically generated"/>
@@ -1042,7 +1042,7 @@
           <w:color w:val="000000" w:themeColor="text1"/>
         </w:rPr>
         <w:drawing>
-          <wp:inline distT="0" distB="0" distL="0" distR="0" wp14:anchorId="525FE073" wp14:editId="43326A9A">
+          <wp:inline distT="0" distB="0" distL="0" distR="0" wp14:anchorId="525FE073" wp14:editId="48E428A6">
             <wp:extent cx="5610069" cy="3802380"/>
             <wp:effectExtent l="0" t="0" r="3810" b="0"/>
             <wp:docPr id="1674557241" name="Picture 8" descr="A screen shot of a computer program&#10;&#10;Description automatically generated"/>
@@ -2602,7 +2602,7 @@
           <w:color w:val="000000" w:themeColor="text1"/>
         </w:rPr>
         <w:drawing>
-          <wp:inline distT="0" distB="0" distL="0" distR="0" wp14:anchorId="5FFD287F" wp14:editId="0E078088">
+          <wp:inline distT="0" distB="0" distL="0" distR="0" wp14:anchorId="5FFD287F" wp14:editId="57288787">
             <wp:extent cx="2963636" cy="2662028"/>
             <wp:effectExtent l="0" t="0" r="0" b="5080"/>
             <wp:docPr id="790917621" name="Picture 21" descr="A screen shot of a computer program&#10;&#10;Description automatically generated"/>
@@ -2723,7 +2723,7 @@
           <w:color w:val="000000" w:themeColor="text1"/>
         </w:rPr>
         <w:drawing>
-          <wp:inline distT="0" distB="0" distL="0" distR="0" wp14:anchorId="58E5EA84" wp14:editId="0762A3F2">
+          <wp:inline distT="0" distB="0" distL="0" distR="0" wp14:anchorId="58E5EA84" wp14:editId="2E24DC6A">
             <wp:extent cx="3584121" cy="2622994"/>
             <wp:effectExtent l="0" t="0" r="0" b="6350"/>
             <wp:docPr id="515938152" name="Picture 23" descr="A screen shot of a computer program&#10;&#10;Description automatically generated"/>
@@ -3118,6 +3118,120 @@
           <w:color w:val="000000" w:themeColor="text1"/>
         </w:rPr>
         <w:t xml:space="preserve"> will display a success notification and redirect the user to the login page. If it fails, a validation error will be displayed below the corresponding input. In addition, additional validation with jQuery Validate ensures that the input is not empty and meets predefined rules before being sent to the server. With the combination of backend validation in Laravel and frontend validation using jQuery, this system ensures that the submitted data is up to standard before further processing.</w:t>
+      </w:r>
+    </w:p>
+    <w:p>
+      <w:pPr>
+        <w:spacing w:line="360" w:lineRule="auto"/>
+        <w:jc w:val="both"/>
+        <w:rPr>
+          <w:rFonts w:ascii="Times New Roman" w:hAnsi="Times New Roman" w:cs="Times New Roman"/>
+          <w:color w:val="000000" w:themeColor="text1"/>
+        </w:rPr>
+        <w:sectPr>
+          <w:pgSz w:w="12240" w:h="15840"/>
+          <w:pgMar w:top="1440" w:right="1440" w:bottom="1440" w:left="1440" w:header="708" w:footer="708" w:gutter="0"/>
+          <w:cols w:space="708"/>
+          <w:docGrid w:linePitch="360"/>
+        </w:sectPr>
+      </w:pPr>
+    </w:p>
+    <w:p>
+      <w:pPr>
+        <w:spacing w:line="360" w:lineRule="auto"/>
+        <w:jc w:val="both"/>
+        <w:rPr>
+          <w:rFonts w:ascii="Times New Roman" w:hAnsi="Times New Roman" w:cs="Times New Roman"/>
+          <w:b/>
+          <w:bCs/>
+          <w:color w:val="000000" w:themeColor="text1"/>
+        </w:rPr>
+      </w:pPr>
+      <w:r>
+        <w:rPr>
+          <w:rFonts w:ascii="Times New Roman" w:hAnsi="Times New Roman" w:cs="Times New Roman"/>
+          <w:b/>
+          <w:bCs/>
+          <w:color w:val="000000" w:themeColor="text1"/>
+        </w:rPr>
+        <w:lastRenderedPageBreak/>
+        <w:t xml:space="preserve">GitHub </w:t>
+      </w:r>
+      <w:r>
+        <w:rPr>
+          <w:rFonts w:ascii="Times New Roman" w:hAnsi="Times New Roman" w:cs="Times New Roman"/>
+          <w:b/>
+          <w:bCs/>
+          <w:color w:val="000000" w:themeColor="text1"/>
+        </w:rPr>
+        <w:t>Push Results</w:t>
+      </w:r>
+      <w:r>
+        <w:rPr>
+          <w:rFonts w:ascii="Times New Roman" w:hAnsi="Times New Roman" w:cs="Times New Roman"/>
+          <w:b/>
+          <w:bCs/>
+          <w:color w:val="000000" w:themeColor="text1"/>
+        </w:rPr>
+        <w:t>:</w:t>
+      </w:r>
+    </w:p>
+    <w:p>
+      <w:pPr>
+        <w:spacing w:line="360" w:lineRule="auto"/>
+        <w:jc w:val="both"/>
+        <w:rPr>
+          <w:rFonts w:ascii="Times New Roman" w:hAnsi="Times New Roman" w:cs="Times New Roman"/>
+          <w:color w:val="000000" w:themeColor="text1"/>
+        </w:rPr>
+      </w:pPr>
+      <w:r>
+        <w:rPr>
+          <w:rFonts w:ascii="Times New Roman" w:hAnsi="Times New Roman" w:cs="Times New Roman"/>
+          <w:noProof/>
+          <w:color w:val="000000" w:themeColor="text1"/>
+        </w:rPr>
+        <w:drawing>
+          <wp:inline distT="0" distB="0" distL="0" distR="0" wp14:anchorId="7F43DDD5" wp14:editId="03FE1610">
+            <wp:extent cx="5943600" cy="1044575"/>
+            <wp:effectExtent l="0" t="0" r="0" b="0"/>
+            <wp:docPr id="47641589" name="Picture 1" descr="A screenshot of a phone&#10;&#10;Description automatically generated"/>
+            <wp:cNvGraphicFramePr>
+              <a:graphicFrameLocks xmlns:a="http://schemas.openxmlformats.org/drawingml/2006/main" noChangeAspect="1"/>
+            </wp:cNvGraphicFramePr>
+            <a:graphic xmlns:a="http://schemas.openxmlformats.org/drawingml/2006/main">
+              <a:graphicData uri="http://schemas.openxmlformats.org/drawingml/2006/picture">
+                <pic:pic xmlns:pic="http://schemas.openxmlformats.org/drawingml/2006/picture">
+                  <pic:nvPicPr>
+                    <pic:cNvPr id="47641589" name="Picture 1" descr="A screenshot of a phone&#10;&#10;Description automatically generated"/>
+                    <pic:cNvPicPr/>
+                  </pic:nvPicPr>
+                  <pic:blipFill>
+                    <a:blip r:embed="rId34">
+                      <a:extLst>
+                        <a:ext uri="{28A0092B-C50C-407E-A947-70E740481C1C}">
+                          <a14:useLocalDpi xmlns:a14="http://schemas.microsoft.com/office/drawing/2010/main" val="0"/>
+                        </a:ext>
+                      </a:extLst>
+                    </a:blip>
+                    <a:stretch>
+                      <a:fillRect/>
+                    </a:stretch>
+                  </pic:blipFill>
+                  <pic:spPr>
+                    <a:xfrm>
+                      <a:off x="0" y="0"/>
+                      <a:ext cx="5943600" cy="1044575"/>
+                    </a:xfrm>
+                    <a:prstGeom prst="rect">
+                      <a:avLst/>
+                    </a:prstGeom>
+                  </pic:spPr>
+                </pic:pic>
+              </a:graphicData>
+            </a:graphic>
+          </wp:inline>
+        </w:drawing>
       </w:r>
     </w:p>
     <w:p>

</xml_diff>